<commit_message>
QC activity timeline — rebuilt with per-task chunks (width = time spent)
One bar per task request on the hour-of-day ruler (Tue 11 Aug 16:00 →
Fri 14 Aug 08:00), bar width = active working time spent, positioned at
real clock time; per-family time table. 4.9 h active across 31 task
requests in 12 families (activity ≤20 min apart). Content-based family
classifier (robust to transcript growth). House-style bilingual docx via
the Letta doc engine.

Co-Authored-By: Claude Fable 5 <noreply@anthropic.com>
Claude-Session: https://claude.ai/code/session_01DyBhj47i7bhaCyNMB1iwdv
</commit_message>
<xml_diff>
--- a/deliverables/timeline/QC_Activity_Timeline_11-14Aug2026.docx
+++ b/deliverables/timeline/QC_Activity_Timeline_11-14Aug2026.docx
@@ -388,7 +388,7 @@
                 <w:spacing w:val="0"/>
                 <w:kern w:val="0"/>
               </w:rPr>
-              <w:t>Ангажирано</w:t>
+              <w:t>Активно</w:t>
             </w:r>
             <w:r>
               <w:rPr>
@@ -412,7 +412,7 @@
                 <w:spacing w:val="0"/>
                 <w:kern w:val="0"/>
               </w:rPr>
-              <w:t>Engaged</w:t>
+              <w:t>Active</w:t>
             </w:r>
           </w:p>
         </w:tc>
@@ -442,7 +442,7 @@
                 <w:spacing w:val="0"/>
                 <w:kern w:val="0"/>
               </w:rPr>
-              <w:t>4.4 ч</w:t>
+              <w:t>4.9 ч</w:t>
             </w:r>
             <w:r>
               <w:rPr>
@@ -466,7 +466,7 @@
                 <w:spacing w:val="0"/>
                 <w:kern w:val="0"/>
               </w:rPr>
-              <w:t>4.4 h</w:t>
+              <w:t>4.9 h</w:t>
             </w:r>
           </w:p>
         </w:tc>
@@ -499,7 +499,7 @@
                 <w:spacing w:val="0"/>
                 <w:kern w:val="0"/>
               </w:rPr>
-              <w:t>Фамилии</w:t>
+              <w:t>Задачи</w:t>
             </w:r>
             <w:r>
               <w:rPr>
@@ -523,7 +523,7 @@
                 <w:spacing w:val="0"/>
                 <w:kern w:val="0"/>
               </w:rPr>
-              <w:t>Families</w:t>
+              <w:t>Task requests</w:t>
             </w:r>
           </w:p>
         </w:tc>
@@ -553,7 +553,7 @@
                 <w:spacing w:val="0"/>
                 <w:kern w:val="0"/>
               </w:rPr>
-              <w:t>12</w:t>
+              <w:t>31</w:t>
             </w:r>
           </w:p>
         </w:tc>
@@ -586,7 +586,7 @@
                 <w:spacing w:val="0"/>
                 <w:kern w:val="0"/>
               </w:rPr>
-              <w:t>Мерка</w:t>
+              <w:t>Фамилии</w:t>
             </w:r>
             <w:r>
               <w:rPr>
@@ -610,7 +610,7 @@
                 <w:spacing w:val="0"/>
                 <w:kern w:val="0"/>
               </w:rPr>
-              <w:t>Measure</w:t>
+              <w:t>Families</w:t>
             </w:r>
           </w:p>
         </w:tc>
@@ -640,31 +640,7 @@
                 <w:spacing w:val="0"/>
                 <w:kern w:val="0"/>
               </w:rPr>
-              <w:t>Ангажирано работно време, паузи &gt;20 мин исклучени</w:t>
-            </w:r>
-            <w:r>
-              <w:rPr>
-                <w:rFonts w:ascii="Calibri" w:hAnsi="Calibri"/>
-                <w:b w:val="0"/>
-                <w:i w:val="0"/>
-                <w:color w:val="000000"/>
-                <w:sz w:val="16"/>
-                <w:spacing w:val="0"/>
-                <w:kern w:val="0"/>
-              </w:rPr>
-              <w:t xml:space="preserve"> | </w:t>
-            </w:r>
-            <w:r>
-              <w:rPr>
-                <w:rFonts w:ascii="Calibri" w:hAnsi="Calibri"/>
-                <w:b w:val="0"/>
-                <w:i/>
-                <w:color w:val="000000"/>
-                <w:sz w:val="16"/>
-                <w:spacing w:val="0"/>
-                <w:kern w:val="0"/>
-              </w:rPr>
-              <w:t>Engaged working time, idle &gt;20 min excluded</w:t>
+              <w:t>12</w:t>
             </w:r>
           </w:p>
         </w:tc>
@@ -751,7 +727,7 @@
                 <w:spacing w:val="0"/>
                 <w:kern w:val="0"/>
               </w:rPr>
-              <w:t>Транскрипт · sha256 857d2d876f29ff90</w:t>
+              <w:t>Транскрипт · sha256 9c35bfad93f16b6d</w:t>
             </w:r>
           </w:p>
         </w:tc>
@@ -1465,14 +1441,13 @@
       <w:r>
         <w:rPr>
           <w:rFonts w:ascii="Calibri" w:hAnsi="Calibri"/>
-          <w:b w:val="0"/>
           <w:i w:val="0"/>
           <w:color w:val="16232B"/>
           <w:sz w:val="21"/>
           <w:spacing w:val="0"/>
           <w:kern w:val="0"/>
         </w:rPr>
-        <w:t>Во периодот од вторник 11.08 во 16:00 ч до петок 14.08 во 08:00 ч (вкупен опсег од 64 часа), концентрираниот ангажман на Контрола на квалитет изнесуваше приближно 4.4 часа активно работно време, распоредено во 53 одделни налети низ 12 фамилии на задачи.</w:t>
+        <w:t>Во периодот од вторник 11.08 во 16:00 ч до петок 14.08 во 08:00 ч (опсег од 64 часа), активното работно време на Контрола на квалитет изнесуваше приближно 4.9 часа, распоредено во 31 задачи низ 12 фамилии. Долунаведената лента го поставува тоа време на скала со ознаки по часови од денот — секое поле е парче време поминато на дадена задача, на неговата вистинска позиција во деновите.</w:t>
       </w:r>
     </w:p>
     <w:p>
@@ -1483,32 +1458,13 @@
       <w:r>
         <w:rPr>
           <w:rFonts w:ascii="Calibri" w:hAnsi="Calibri"/>
-          <w:b w:val="0"/>
-          <w:i w:val="0"/>
-          <w:color w:val="16232B"/>
-          <w:sz w:val="21"/>
-          <w:spacing w:val="0"/>
-          <w:kern w:val="0"/>
-        </w:rPr>
-        <w:t>Долунаведената хоризонтална лента го прикажува тоа време на скала со ознаки по часови од денот — секое поле е конкретно парче време поминато на дадена задача, поставено на неговата вистинска временска позиција.</w:t>
-      </w:r>
-    </w:p>
-    <w:p>
-      <w:pPr>
-        <w:spacing w:before="40" w:after="40" w:line="254" w:lineRule="auto"/>
-        <w:jc w:val="left"/>
-      </w:pPr>
-      <w:r>
-        <w:rPr>
-          <w:rFonts w:ascii="Calibri" w:hAnsi="Calibri"/>
-          <w:b w:val="0"/>
           <w:i/>
           <w:color w:val="4A5B6C"/>
           <w:sz w:val="18"/>
           <w:spacing w:val="0"/>
           <w:kern w:val="0"/>
         </w:rPr>
-        <w:t>Over Tue 11.08 16:00 to Fri 14.08 08:00 (a 64-hour window), concentrated QC engagement came to about 4.4 hours of active working time, spread over 53 distinct bursts across 12 task families. The band below places that time on an hour-of-day ruler — each bar is a real chunk of time spent on a task, at its actual clock position.</w:t>
+        <w:t>Over Tue 11.08 16:00 to Fri 14.08 08:00 (a 64-hour window), active QC working time came to about 4.9 hours, spread over 31 task requests across 12 families. The band below places that time on an hour-of-day ruler; each bar is a chunk of time spent on a task, at its real position in the days, and its width is the time spent.</w:t>
       </w:r>
     </w:p>
     <w:p>
@@ -1564,7 +1520,7 @@
         </w:rPr>
         <w:drawing>
           <wp:inline xmlns:a="http://schemas.openxmlformats.org/drawingml/2006/main" xmlns:pic="http://schemas.openxmlformats.org/drawingml/2006/picture">
-            <wp:extent cx="5580000" cy="3128182"/>
+            <wp:extent cx="5580000" cy="3164776"/>
             <wp:docPr id="1" name="Picture 1"/>
             <wp:cNvGraphicFramePr>
               <a:graphicFrameLocks noChangeAspect="1"/>
@@ -1585,7 +1541,7 @@
                   <pic:spPr>
                     <a:xfrm>
                       <a:off x="0" y="0"/>
-                      <a:ext cx="5580000" cy="3128182"/>
+                      <a:ext cx="5580000" cy="3164776"/>
                     </a:xfrm>
                     <a:prstGeom prst="rect"/>
                   </pic:spPr>
@@ -1993,7 +1949,7 @@
                 <w:spacing w:val="0"/>
                 <w:kern w:val="0"/>
               </w:rPr>
-              <w:t>8%</w:t>
+              <w:t>7%</w:t>
             </w:r>
           </w:p>
         </w:tc>
@@ -2091,7 +2047,7 @@
                 <w:spacing w:val="0"/>
                 <w:kern w:val="0"/>
               </w:rPr>
-              <w:t>19%</w:t>
+              <w:t>17%</w:t>
             </w:r>
           </w:p>
         </w:tc>
@@ -2189,7 +2145,7 @@
                 <w:spacing w:val="0"/>
                 <w:kern w:val="0"/>
               </w:rPr>
-              <w:t>10%</w:t>
+              <w:t>9%</w:t>
             </w:r>
           </w:p>
         </w:tc>
@@ -2287,7 +2243,7 @@
                 <w:spacing w:val="0"/>
                 <w:kern w:val="0"/>
               </w:rPr>
-              <w:t>11%</w:t>
+              <w:t>10%</w:t>
             </w:r>
           </w:p>
         </w:tc>
@@ -2385,7 +2341,7 @@
                 <w:spacing w:val="0"/>
                 <w:kern w:val="0"/>
               </w:rPr>
-              <w:t>13%</w:t>
+              <w:t>11%</w:t>
             </w:r>
           </w:p>
         </w:tc>
@@ -2483,7 +2439,7 @@
                 <w:spacing w:val="0"/>
                 <w:kern w:val="0"/>
               </w:rPr>
-              <w:t>8%</w:t>
+              <w:t>7%</w:t>
             </w:r>
           </w:p>
         </w:tc>
@@ -2581,7 +2537,7 @@
                 <w:spacing w:val="0"/>
                 <w:kern w:val="0"/>
               </w:rPr>
-              <w:t>2%</w:t>
+              <w:t>1%</w:t>
             </w:r>
           </w:p>
         </w:tc>
@@ -2631,7 +2587,7 @@
                 <w:spacing w:val="0"/>
                 <w:kern w:val="0"/>
               </w:rPr>
-              <w:t>8</w:t>
+              <w:t>10</w:t>
             </w:r>
           </w:p>
         </w:tc>
@@ -2655,7 +2611,7 @@
                 <w:spacing w:val="0"/>
                 <w:kern w:val="0"/>
               </w:rPr>
-              <w:t>0.1</w:t>
+              <w:t>0.2</w:t>
             </w:r>
           </w:p>
         </w:tc>
@@ -2777,7 +2733,7 @@
                 <w:spacing w:val="0"/>
                 <w:kern w:val="0"/>
               </w:rPr>
-              <w:t>11%</w:t>
+              <w:t>10%</w:t>
             </w:r>
           </w:p>
         </w:tc>
@@ -2827,7 +2783,7 @@
                 <w:spacing w:val="0"/>
                 <w:kern w:val="0"/>
               </w:rPr>
-              <w:t>24</w:t>
+              <w:t>25</w:t>
             </w:r>
           </w:p>
         </w:tc>
@@ -2925,7 +2881,7 @@
                 <w:spacing w:val="0"/>
                 <w:kern w:val="0"/>
               </w:rPr>
-              <w:t>6</w:t>
+              <w:t>31</w:t>
             </w:r>
           </w:p>
         </w:tc>
@@ -2949,7 +2905,7 @@
                 <w:spacing w:val="0"/>
                 <w:kern w:val="0"/>
               </w:rPr>
-              <w:t>0.1</w:t>
+              <w:t>0.5</w:t>
             </w:r>
           </w:p>
         </w:tc>
@@ -2973,7 +2929,7 @@
                 <w:spacing w:val="0"/>
                 <w:kern w:val="0"/>
               </w:rPr>
-              <w:t>2%</w:t>
+              <w:t>11%</w:t>
             </w:r>
           </w:p>
         </w:tc>
@@ -3023,7 +2979,7 @@
                 <w:spacing w:val="0"/>
                 <w:kern w:val="0"/>
               </w:rPr>
-              <w:t>262</w:t>
+              <w:t>293</w:t>
             </w:r>
           </w:p>
         </w:tc>
@@ -3047,7 +3003,7 @@
                 <w:spacing w:val="0"/>
                 <w:kern w:val="0"/>
               </w:rPr>
-              <w:t>4.4</w:t>
+              <w:t>4.9</w:t>
             </w:r>
           </w:p>
         </w:tc>
@@ -3085,14 +3041,13 @@
       <w:r>
         <w:rPr>
           <w:rFonts w:ascii="Calibri" w:hAnsi="Calibri"/>
-          <w:b w:val="0"/>
           <w:i/>
           <w:color w:val="4A5B6C"/>
           <w:sz w:val="17"/>
           <w:spacing w:val="0"/>
           <w:kern w:val="0"/>
         </w:rPr>
-        <w:t>Мерката е ангажирано работно време (од барањето до испораката), при што паузите подолги од 20 минути се исклучени; затоа збирот (4.4 ч) е помал од 64-часовниот календарски опсег. Најголема активност беше во четврток.</w:t>
+        <w:t>Мерка: активно работно време (настани на активност на растојание ≤20 мин); паузите подолги од 20 мин не се бројат, па збирот (4.9 ч) е помал од 64-часовниот опсег. Најмногу работа падна во четврток.</w:t>
       </w:r>
     </w:p>
     <w:sectPr>
@@ -3324,8 +3279,6 @@
               <w:b/>
               <w:bCs/>
               <w:noProof/>
-              <w:spacing w:val="0"/>
-              <w:kern w:val="0"/>
             </w:rPr>
             <w:drawing>
               <wp:anchor distT="0" distB="0" distL="114300" distR="114300" simplePos="0" relativeHeight="251661312" behindDoc="0" locked="0" layoutInCell="1" allowOverlap="1" wp14:anchorId="3F3B7D12" wp14:editId="313BF894">
@@ -3418,8 +3371,6 @@
             <w:rPr>
               <w:rFonts w:ascii="Calibri" w:hAnsi="Calibri" w:cs="Calibri"/>
               <w:lang w:val="mk-MK"/>
-              <w:spacing w:val="0"/>
-              <w:kern w:val="0"/>
             </w:rPr>
             <w:t>Име на документ</w:t>
           </w:r>
@@ -3427,24 +3378,18 @@
             <w:rPr>
               <w:rFonts w:ascii="Calibri" w:eastAsia="Calibri" w:hAnsi="Calibri" w:cs="Calibri"/>
               <w:lang w:val="ru-RU"/>
-              <w:spacing w:val="0"/>
-              <w:kern w:val="0"/>
             </w:rPr>
             <w:t xml:space="preserve"> | </w:t>
           </w:r>
           <w:r>
             <w:rPr>
               <w:rFonts w:ascii="Calibri" w:eastAsia="Calibri" w:hAnsi="Calibri" w:cs="Calibri"/>
-              <w:spacing w:val="0"/>
-              <w:kern w:val="0"/>
             </w:rPr>
             <w:t>D</w:t>
           </w:r>
           <w:r>
             <w:rPr>
               <w:rFonts w:ascii="Calibri" w:eastAsia="Calibri" w:hAnsi="Calibri" w:cs="Calibri"/>
-              <w:spacing w:val="0"/>
-              <w:kern w:val="0"/>
             </w:rPr>
             <w:t>ocument</w:t>
           </w:r>
@@ -3452,16 +3397,12 @@
             <w:rPr>
               <w:rFonts w:ascii="Calibri" w:eastAsia="Calibri" w:hAnsi="Calibri" w:cs="Calibri"/>
               <w:lang w:val="ru-RU"/>
-              <w:spacing w:val="0"/>
-              <w:kern w:val="0"/>
             </w:rPr>
             <w:t xml:space="preserve"> </w:t>
           </w:r>
           <w:r>
             <w:rPr>
               <w:rFonts w:ascii="Calibri" w:eastAsia="Calibri" w:hAnsi="Calibri" w:cs="Calibri"/>
-              <w:spacing w:val="0"/>
-              <w:kern w:val="0"/>
             </w:rPr>
             <w:t>name</w:t>
           </w:r>
@@ -3469,8 +3410,6 @@
             <w:rPr>
               <w:rFonts w:ascii="Calibri" w:eastAsia="Calibri" w:hAnsi="Calibri" w:cs="Calibri"/>
               <w:lang w:val="ru-RU"/>
-              <w:spacing w:val="0"/>
-              <w:kern w:val="0"/>
             </w:rPr>
             <w:t>:</w:t>
           </w:r>
@@ -3492,8 +3431,6 @@
               <w:sz w:val="28"/>
               <w:szCs w:val="28"/>
               <w:lang w:val="mk-MK"/>
-              <w:spacing w:val="0"/>
-              <w:kern w:val="0"/>
             </w:rPr>
             <w:t xml:space="preserve">ЗАПИС — </w:t>
           </w:r>
@@ -3504,8 +3441,6 @@
               <w:bCs/>
               <w:sz w:val="24"/>
               <w:szCs w:val="24"/>
-              <w:spacing w:val="0"/>
-              <w:kern w:val="0"/>
             </w:rPr>
             <w:br/>
           </w:r>
@@ -3517,8 +3452,6 @@
               <w:sz w:val="28"/>
               <w:szCs w:val="28"/>
               <w:lang w:val="mk-MK"/>
-              <w:spacing w:val="0"/>
-              <w:kern w:val="0"/>
             </w:rPr>
             <w:t>PP-QC-ACT</w:t>
           </w:r>
@@ -3527,8 +3460,6 @@
               <w:rFonts w:ascii="Arial Narrow" w:hAnsi="Arial Narrow" w:cs="Arial Narrow"/>
               <w:sz w:val="24"/>
               <w:szCs w:val="24"/>
-              <w:spacing w:val="0"/>
-              <w:kern w:val="0"/>
             </w:rPr>
             <w:t xml:space="preserve"> | </w:t>
           </w:r>
@@ -3537,16 +3468,12 @@
               <w:rFonts w:ascii="Arial Narrow" w:hAnsi="Arial Narrow" w:cs="Arial Narrow"/>
               <w:sz w:val="24"/>
               <w:szCs w:val="24"/>
-              <w:spacing w:val="0"/>
-              <w:kern w:val="0"/>
             </w:rPr>
             <w:br/>
           </w:r>
           <w:r>
             <w:rPr>
               <w:rFonts w:ascii="Arial Narrow" w:hAnsi="Arial Narrow" w:cs="Arial Narrow"/>
-              <w:spacing w:val="0"/>
-              <w:kern w:val="0"/>
             </w:rPr>
             <w:t xml:space="preserve">Record — </w:t>
           </w:r>
@@ -3581,16 +3508,12 @@
             <w:rPr>
               <w:rFonts w:ascii="Calibri" w:hAnsi="Calibri" w:cs="Calibri"/>
               <w:lang w:val="mk-MK"/>
-              <w:spacing w:val="0"/>
-              <w:kern w:val="0"/>
             </w:rPr>
             <w:t>Документ</w:t>
           </w:r>
           <w:r>
             <w:rPr>
               <w:rFonts w:ascii="Calibri" w:hAnsi="Calibri" w:cs="Calibri"/>
-              <w:spacing w:val="0"/>
-              <w:kern w:val="0"/>
             </w:rPr>
             <w:t xml:space="preserve"> </w:t>
           </w:r>
@@ -3598,24 +3521,18 @@
             <w:rPr>
               <w:rFonts w:ascii="Calibri" w:hAnsi="Calibri" w:cs="Calibri"/>
               <w:lang w:val="mk-MK"/>
-              <w:spacing w:val="0"/>
-              <w:kern w:val="0"/>
             </w:rPr>
             <w:t>бр.</w:t>
           </w:r>
           <w:r>
             <w:rPr>
               <w:rFonts w:ascii="Calibri" w:eastAsia="Calibri" w:hAnsi="Calibri" w:cs="Calibri"/>
-              <w:spacing w:val="0"/>
-              <w:kern w:val="0"/>
             </w:rPr>
             <w:t xml:space="preserve"> </w:t>
           </w:r>
           <w:r>
             <w:rPr>
               <w:rFonts w:ascii="Calibri" w:eastAsia="Calibri" w:hAnsi="Calibri" w:cs="Calibri"/>
-              <w:spacing w:val="0"/>
-              <w:kern w:val="0"/>
             </w:rPr>
             <w:t>|</w:t>
           </w:r>
@@ -3641,8 +3558,6 @@
               <w:rFonts w:ascii="Calibri" w:eastAsia="Calibri" w:hAnsi="Calibri" w:cs="Calibri"/>
               <w:sz w:val="18"/>
               <w:szCs w:val="18"/>
-              <w:spacing w:val="0"/>
-              <w:kern w:val="0"/>
             </w:rPr>
             <w:t>Code of document:</w:t>
           </w:r>
@@ -3651,8 +3566,6 @@
               <w:rFonts w:ascii="Calibri" w:hAnsi="Calibri" w:cs="Calibri"/>
               <w:sz w:val="18"/>
               <w:szCs w:val="18"/>
-              <w:spacing w:val="0"/>
-              <w:kern w:val="0"/>
             </w:rPr>
             <w:t xml:space="preserve"> </w:t>
           </w:r>
@@ -3661,8 +3574,6 @@
               <w:rFonts w:ascii="Calibri" w:hAnsi="Calibri" w:cs="Calibri"/>
               <w:b/>
               <w:sz w:val="18"/>
-              <w:spacing w:val="0"/>
-              <w:kern w:val="0"/>
             </w:rPr>
             <w:br/>
           </w:r>
@@ -3690,8 +3601,6 @@
               <w:b/>
               <w:sz w:val="22"/>
               <w:szCs w:val="24"/>
-              <w:spacing w:val="0"/>
-              <w:kern w:val="0"/>
             </w:rPr>
             <w:t>PP-QC-ACT-</w:t>
           </w:r>
@@ -3700,8 +3609,6 @@
               <w:rFonts w:ascii="Calibri" w:hAnsi="Calibri" w:cs="Calibri"/>
               <w:b/>
               <w:sz w:val="18"/>
-              <w:spacing w:val="0"/>
-              <w:kern w:val="0"/>
             </w:rPr>
             <w:br/>
           </w:r>
@@ -3710,8 +3617,6 @@
               <w:rFonts w:ascii="Calibri" w:hAnsi="Calibri" w:cs="Calibri"/>
               <w:b/>
               <w:szCs w:val="22"/>
-              <w:spacing w:val="0"/>
-              <w:kern w:val="0"/>
             </w:rPr>
             <w:t>001/202</w:t>
           </w:r>
@@ -3720,8 +3625,6 @@
               <w:rFonts w:ascii="Calibri" w:hAnsi="Calibri" w:cs="Calibri"/>
               <w:b/>
               <w:szCs w:val="22"/>
-              <w:spacing w:val="0"/>
-              <w:kern w:val="0"/>
             </w:rPr>
             <w:t>6</w:t>
           </w:r>
@@ -3822,16 +3725,12 @@
             <w:rPr>
               <w:rFonts w:ascii="Calibri" w:hAnsi="Calibri" w:cs="Calibri"/>
               <w:lang w:val="mk-MK"/>
-              <w:spacing w:val="0"/>
-              <w:kern w:val="0"/>
             </w:rPr>
             <w:t>Верзија</w:t>
           </w:r>
           <w:r>
             <w:rPr>
               <w:rFonts w:ascii="Calibri" w:hAnsi="Calibri" w:cs="Calibri"/>
-              <w:spacing w:val="0"/>
-              <w:kern w:val="0"/>
             </w:rPr>
             <w:t xml:space="preserve"> | </w:t>
           </w:r>
@@ -3840,8 +3739,6 @@
               <w:rFonts w:ascii="Calibri" w:hAnsi="Calibri" w:cs="Calibri"/>
               <w:sz w:val="16"/>
               <w:szCs w:val="16"/>
-              <w:spacing w:val="0"/>
-              <w:kern w:val="0"/>
             </w:rPr>
             <w:t>Ver</w:t>
           </w:r>
@@ -3850,8 +3747,6 @@
               <w:rFonts w:ascii="Calibri" w:eastAsia="Calibri" w:hAnsi="Calibri" w:cs="Calibri"/>
               <w:sz w:val="16"/>
               <w:szCs w:val="16"/>
-              <w:spacing w:val="0"/>
-              <w:kern w:val="0"/>
             </w:rPr>
             <w:t xml:space="preserve"> </w:t>
           </w:r>
@@ -3859,8 +3754,6 @@
             <w:rPr>
               <w:rFonts w:ascii="Calibri" w:eastAsia="Calibri" w:hAnsi="Calibri" w:cs="Calibri"/>
               <w:bCs/>
-              <w:spacing w:val="0"/>
-              <w:kern w:val="0"/>
             </w:rPr>
             <w:t>:</w:t>
           </w:r>
@@ -3868,8 +3761,6 @@
             <w:rPr>
               <w:rFonts w:ascii="Calibri" w:eastAsia="Calibri" w:hAnsi="Calibri" w:cs="Calibri"/>
               <w:b/>
-              <w:spacing w:val="0"/>
-              <w:kern w:val="0"/>
             </w:rPr>
             <w:t xml:space="preserve"> </w:t>
           </w:r>
@@ -3878,8 +3769,6 @@
               <w:rFonts w:ascii="Calibri" w:eastAsia="Calibri" w:hAnsi="Calibri" w:cs="Calibri"/>
               <w:b/>
               <w:bCs/>
-              <w:spacing w:val="0"/>
-              <w:kern w:val="0"/>
             </w:rPr>
             <w:t>1.0</w:t>
           </w:r>
@@ -3898,8 +3787,6 @@
     <w:r>
       <w:rPr>
         <w:noProof/>
-        <w:spacing w:val="0"/>
-        <w:kern w:val="0"/>
       </w:rPr>
       <w:drawing>
         <wp:anchor distT="0" distB="0" distL="114300" distR="114300" simplePos="0" relativeHeight="251662336" behindDoc="0" locked="0" layoutInCell="1" allowOverlap="1" wp14:anchorId="11090D1D" wp14:editId="2348CF94">

</xml_diff>